<commit_message>
Fix notice formatting: NOT_FOUND sanitization, RESET FORM removal, page 2 blank space, amount spacing
- 3B: Sanitize NOT_FOUND/empty/N/A values to blank lines before template fill
- 3C: Remove RESET FORM shape from residential template (Choice + Fallback)
- 3E: Remove duplicate header image and 11 empty paragraphs causing blank page 2
- 3A: Double-tab between due date and amount for clear spacing

Co-Authored-By: Claude Opus 4.6 <noreply@anthropic.com>
</commit_message>
<xml_diff>
--- a/templates/3-Day Notice - BLUEPRINT - residential - NEW BRANDING_071125_v2.docx
+++ b/templates/3-Day Notice - BLUEPRINT - residential - NEW BRANDING_071125_v2.docx
@@ -829,92 +829,6 @@
                           </a:prstGeom>
                         </pic:spPr>
                       </pic:pic>
-                      <wps:wsp>
-                        <wps:cNvPr id="4" name="Textbox 4"/>
-                        <wps:cNvSpPr txBox="1"/>
-                        <wps:spPr>
-                          <a:xfrm>
-                            <a:off x="5685625" y="91528"/>
-                            <a:ext cx="1800860" cy="932180"/>
-                          </a:xfrm>
-                          <a:prstGeom prst="rect">
-                            <a:avLst/>
-                          </a:prstGeom>
-                          <a:solidFill>
-                            <a:srgbClr val="BFBFBF"/>
-                          </a:solidFill>
-                          <a:ln w="12700">
-                            <a:solidFill>
-                              <a:srgbClr val="000000"/>
-                            </a:solidFill>
-                            <a:prstDash val="solid"/>
-                          </a:ln>
-                        </wps:spPr>
-                        <wps:txbx>
-                          <w:txbxContent>
-                            <w:p>
-                              <w:pPr>
-                                <w:rPr>
-                                  <w:color w:val="000000"/>
-                                  <w:sz w:val="24"/>
-                                </w:rPr>
-                              </w:pPr>
-                            </w:p>
-                            <w:p>
-                              <w:pPr>
-                                <w:spacing w:before="29"/>
-                                <w:rPr>
-                                  <w:color w:val="000000"/>
-                                  <w:sz w:val="24"/>
-                                </w:rPr>
-                              </w:pPr>
-                            </w:p>
-                            <w:p>
-                              <w:pPr>
-                                <w:ind w:left="622"/>
-                                <w:rPr>
-                                  <w:rFonts w:ascii="Arial"/>
-                                  <w:b/>
-                                  <w:color w:val="000000"/>
-                                  <w:sz w:val="24"/>
-                                </w:rPr>
-                              </w:pPr>
-                              <w:r>
-                                <w:rPr>
-                                  <w:rFonts w:ascii="Arial"/>
-                                  <w:b/>
-                                  <w:color w:val="000000"/>
-                                  <w:sz w:val="24"/>
-                                </w:rPr>
-                                <w:t>RESET</w:t>
-                              </w:r>
-                              <w:r>
-                                <w:rPr>
-                                  <w:rFonts w:ascii="Arial"/>
-                                  <w:b/>
-                                  <w:color w:val="000000"/>
-                                  <w:spacing w:val="-2"/>
-                                  <w:sz w:val="24"/>
-                                </w:rPr>
-                                <w:t xml:space="preserve"> </w:t>
-                              </w:r>
-                              <w:r>
-                                <w:rPr>
-                                  <w:rFonts w:ascii="Arial"/>
-                                  <w:b/>
-                                  <w:color w:val="000000"/>
-                                  <w:spacing w:val="-4"/>
-                                  <w:sz w:val="24"/>
-                                </w:rPr>
-                                <w:t>FORM</w:t>
-                              </w:r>
-                            </w:p>
-                          </w:txbxContent>
-                        </wps:txbx>
-                        <wps:bodyPr wrap="square" lIns="0" tIns="0" rIns="0" bIns="0" rtlCol="0">
-                          <a:noAutofit/>
-                        </wps:bodyPr>
-                      </wps:wsp>
                     </wpg:wgp>
                   </a:graphicData>
                 </a:graphic>
@@ -950,116 +864,12 @@
                   <v:stroke joinstyle="miter"/>
                   <v:path gradientshapeok="t" o:connecttype="rect"/>
                 </v:shapetype>
-                <v:shape id="Textbox 4" o:spid="_x0000_s1028" type="#_x0000_t202" style="position:absolute;left:56856;top:915;width:18008;height:9322;visibility:visible;mso-wrap-style:square;v-text-anchor:top" o:gfxdata="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" fillcolor="#bfbfbf" strokeweight="1pt">
-                  <v:textbox inset="0,0,0,0">
-                    <w:txbxContent>
-                      <w:p>
-                        <w:pPr>
-                          <w:rPr>
-                            <w:color w:val="000000"/>
-                            <w:sz w:val="24"/>
-                          </w:rPr>
-                        </w:pPr>
-                      </w:p>
-                      <w:p>
-                        <w:pPr>
-                          <w:spacing w:before="29"/>
-                          <w:rPr>
-                            <w:color w:val="000000"/>
-                            <w:sz w:val="24"/>
-                          </w:rPr>
-                        </w:pPr>
-                      </w:p>
-                      <w:p>
-                        <w:pPr>
-                          <w:ind w:left="622"/>
-                          <w:rPr>
-                            <w:rFonts w:ascii="Arial"/>
-                            <w:b/>
-                            <w:color w:val="000000"/>
-                            <w:sz w:val="24"/>
-                          </w:rPr>
-                        </w:pPr>
-                        <w:r>
-                          <w:rPr>
-                            <w:rFonts w:ascii="Arial"/>
-                            <w:b/>
-                            <w:color w:val="000000"/>
-                            <w:sz w:val="24"/>
-                          </w:rPr>
-                          <w:t>RESET</w:t>
-                        </w:r>
-                        <w:r>
-                          <w:rPr>
-                            <w:rFonts w:ascii="Arial"/>
-                            <w:b/>
-                            <w:color w:val="000000"/>
-                            <w:spacing w:val="-2"/>
-                            <w:sz w:val="24"/>
-                          </w:rPr>
-                          <w:t xml:space="preserve"> </w:t>
-                        </w:r>
-                        <w:r>
-                          <w:rPr>
-                            <w:rFonts w:ascii="Arial"/>
-                            <w:b/>
-                            <w:color w:val="000000"/>
-                            <w:spacing w:val="-4"/>
-                            <w:sz w:val="24"/>
-                          </w:rPr>
-                          <w:t>FORM</w:t>
-                        </w:r>
-                      </w:p>
-                    </w:txbxContent>
-                  </v:textbox>
-                </v:shape>
                 <w10:wrap anchorx="page" anchory="page"/>
               </v:group>
             </w:pict>
           </mc:Fallback>
         </mc:AlternateContent>
       </w:r>
-    </w:p>
-    <w:p>
-      <w:pPr>
-        <w:pStyle w:val="BodyText"/>
-        <w:rPr>
-          <w:b/>
-        </w:rPr>
-      </w:pPr>
-    </w:p>
-    <w:p>
-      <w:pPr>
-        <w:pStyle w:val="BodyText"/>
-        <w:rPr>
-          <w:b/>
-        </w:rPr>
-      </w:pPr>
-    </w:p>
-    <w:p>
-      <w:pPr>
-        <w:pStyle w:val="BodyText"/>
-        <w:rPr>
-          <w:b/>
-        </w:rPr>
-      </w:pPr>
-    </w:p>
-    <w:p>
-      <w:pPr>
-        <w:pStyle w:val="BodyText"/>
-        <w:rPr>
-          <w:b/>
-        </w:rPr>
-      </w:pPr>
-    </w:p>
-    <w:p>
-      <w:pPr>
-        <w:pStyle w:val="BodyText"/>
-        <w:spacing w:before="105"/>
-        <w:rPr>
-          <w:b/>
-        </w:rPr>
-      </w:pPr>
     </w:p>
     <w:p>
       <w:pPr>
@@ -2242,91 +2052,6 @@
           <w:pgMar w:top="0" w:right="360" w:bottom="660" w:left="1080" w:header="0" w:footer="474" w:gutter="0"/>
           <w:cols w:space="720"/>
         </w:sectPr>
-      </w:pPr>
-    </w:p>
-    <w:p>
-      <w:pPr>
-        <w:pStyle w:val="BodyText"/>
-      </w:pPr>
-      <w:r>
-        <w:rPr>
-          <w:noProof/>
-        </w:rPr>
-        <w:lastRenderedPageBreak/>
-        <w:drawing>
-          <wp:anchor distT="0" distB="0" distL="0" distR="0" simplePos="0" relativeHeight="15729664" behindDoc="0" locked="0" layoutInCell="1" allowOverlap="1" wp14:anchorId="66BE6BA3" wp14:editId="66BE6BA4">
-            <wp:simplePos x="0" y="0"/>
-            <wp:positionH relativeFrom="page">
-              <wp:posOffset>0</wp:posOffset>
-            </wp:positionH>
-            <wp:positionV relativeFrom="page">
-              <wp:posOffset>0</wp:posOffset>
-            </wp:positionV>
-            <wp:extent cx="7772400" cy="1090097"/>
-            <wp:effectExtent l="0" t="0" r="0" b="0"/>
-            <wp:wrapNone/>
-            <wp:docPr id="6" name="Image 6"/>
-            <wp:cNvGraphicFramePr>
-              <a:graphicFrameLocks xmlns:a="http://schemas.openxmlformats.org/drawingml/2006/main"/>
-            </wp:cNvGraphicFramePr>
-            <a:graphic xmlns:a="http://schemas.openxmlformats.org/drawingml/2006/main">
-              <a:graphicData uri="http://schemas.openxmlformats.org/drawingml/2006/picture">
-                <pic:pic xmlns:pic="http://schemas.openxmlformats.org/drawingml/2006/picture">
-                  <pic:nvPicPr>
-                    <pic:cNvPr id="6" name="Image 6"/>
-                    <pic:cNvPicPr/>
-                  </pic:nvPicPr>
-                  <pic:blipFill>
-                    <a:blip r:embed="rId11" cstate="print"/>
-                    <a:stretch>
-                      <a:fillRect/>
-                    </a:stretch>
-                  </pic:blipFill>
-                  <pic:spPr>
-                    <a:xfrm>
-                      <a:off x="0" y="0"/>
-                      <a:ext cx="7772400" cy="1090097"/>
-                    </a:xfrm>
-                    <a:prstGeom prst="rect">
-                      <a:avLst/>
-                    </a:prstGeom>
-                  </pic:spPr>
-                </pic:pic>
-              </a:graphicData>
-            </a:graphic>
-          </wp:anchor>
-        </w:drawing>
-      </w:r>
-    </w:p>
-    <w:p>
-      <w:pPr>
-        <w:pStyle w:val="BodyText"/>
-      </w:pPr>
-    </w:p>
-    <w:p>
-      <w:pPr>
-        <w:pStyle w:val="BodyText"/>
-      </w:pPr>
-    </w:p>
-    <w:p>
-      <w:pPr>
-        <w:pStyle w:val="BodyText"/>
-      </w:pPr>
-    </w:p>
-    <w:p>
-      <w:pPr>
-        <w:pStyle w:val="BodyText"/>
-      </w:pPr>
-    </w:p>
-    <w:p>
-      <w:pPr>
-        <w:pStyle w:val="BodyText"/>
-      </w:pPr>
-    </w:p>
-    <w:p>
-      <w:pPr>
-        <w:pStyle w:val="BodyText"/>
-        <w:spacing w:before="113"/>
       </w:pPr>
     </w:p>
     <w:p>

</xml_diff>

<commit_message>
Fix address duplication and header image overlap in notice generation
- Add property_address_street/city as separate API fields to avoid splitting errors
- Move header image anchor from P21 to P0 in residential template to prevent overlap
- Keep backward-compatible split fallback for property_address-only requests

Co-Authored-By: Claude Opus 4.6 <noreply@anthropic.com>
</commit_message>
<xml_diff>
--- a/templates/3-Day Notice - BLUEPRINT - residential - NEW BRANDING_071125_v2.docx
+++ b/templates/3-Day Notice - BLUEPRINT - residential - NEW BRANDING_071125_v2.docx
@@ -7,768 +7,6 @@
         <w:pStyle w:val="BodyText"/>
         <w:rPr>
           <w:sz w:val="31"/>
-        </w:rPr>
-      </w:pPr>
-    </w:p>
-    <w:p>
-      <w:pPr>
-        <w:pStyle w:val="BodyText"/>
-        <w:rPr>
-          <w:sz w:val="31"/>
-        </w:rPr>
-      </w:pPr>
-    </w:p>
-    <w:p>
-      <w:pPr>
-        <w:pStyle w:val="BodyText"/>
-        <w:rPr>
-          <w:sz w:val="31"/>
-        </w:rPr>
-      </w:pPr>
-    </w:p>
-    <w:p>
-      <w:pPr>
-        <w:pStyle w:val="BodyText"/>
-        <w:rPr>
-          <w:sz w:val="31"/>
-        </w:rPr>
-      </w:pPr>
-    </w:p>
-    <w:p>
-      <w:pPr>
-        <w:pStyle w:val="BodyText"/>
-        <w:spacing w:before="179"/>
-        <w:rPr>
-          <w:sz w:val="31"/>
-        </w:rPr>
-      </w:pPr>
-    </w:p>
-    <w:p>
-      <w:pPr>
-        <w:pStyle w:val="Title"/>
-      </w:pPr>
-      <w:r>
-        <w:rPr>
-          <w:color w:val="0B0B0B"/>
-        </w:rPr>
-        <w:t>THREE</w:t>
-      </w:r>
-      <w:r>
-        <w:rPr>
-          <w:color w:val="0B0B0B"/>
-          <w:spacing w:val="-6"/>
-        </w:rPr>
-        <w:t xml:space="preserve"> </w:t>
-      </w:r>
-      <w:r>
-        <w:rPr>
-          <w:color w:val="0B0B0B"/>
-        </w:rPr>
-        <w:t>(3)</w:t>
-      </w:r>
-      <w:r>
-        <w:rPr>
-          <w:color w:val="0B0B0B"/>
-          <w:spacing w:val="-8"/>
-        </w:rPr>
-        <w:t xml:space="preserve"> </w:t>
-      </w:r>
-      <w:r>
-        <w:rPr>
-          <w:color w:val="0B0B0B"/>
-        </w:rPr>
-        <w:t>DAY</w:t>
-      </w:r>
-      <w:r>
-        <w:rPr>
-          <w:color w:val="0B0B0B"/>
-          <w:spacing w:val="-5"/>
-        </w:rPr>
-        <w:t xml:space="preserve"> </w:t>
-      </w:r>
-      <w:r>
-        <w:rPr>
-          <w:color w:val="0B0B0B"/>
-        </w:rPr>
-        <w:t>NOTICE</w:t>
-      </w:r>
-      <w:r>
-        <w:rPr>
-          <w:color w:val="0B0B0B"/>
-          <w:spacing w:val="-8"/>
-        </w:rPr>
-        <w:t xml:space="preserve"> </w:t>
-      </w:r>
-      <w:r>
-        <w:rPr>
-          <w:color w:val="0B0B0B"/>
-        </w:rPr>
-        <w:t>TO</w:t>
-      </w:r>
-      <w:r>
-        <w:rPr>
-          <w:color w:val="0B0B0B"/>
-          <w:spacing w:val="-9"/>
-        </w:rPr>
-        <w:t xml:space="preserve"> </w:t>
-      </w:r>
-      <w:r>
-        <w:rPr>
-          <w:color w:val="0B0B0B"/>
-        </w:rPr>
-        <w:t>PAY</w:t>
-      </w:r>
-      <w:r>
-        <w:rPr>
-          <w:color w:val="0B0B0B"/>
-          <w:spacing w:val="-9"/>
-        </w:rPr>
-        <w:t xml:space="preserve"> </w:t>
-      </w:r>
-      <w:r>
-        <w:rPr>
-          <w:color w:val="0B0B0B"/>
-        </w:rPr>
-        <w:t>OR</w:t>
-      </w:r>
-      <w:r>
-        <w:rPr>
-          <w:color w:val="0B0B0B"/>
-          <w:spacing w:val="-6"/>
-        </w:rPr>
-        <w:t xml:space="preserve"> </w:t>
-      </w:r>
-      <w:r>
-        <w:rPr>
-          <w:color w:val="0B0B0B"/>
-          <w:spacing w:val="-4"/>
-        </w:rPr>
-        <w:t>QUIT</w:t>
-      </w:r>
-    </w:p>
-    <w:p>
-      <w:pPr>
-        <w:pStyle w:val="BodyText"/>
-        <w:spacing w:before="29"/>
-        <w:rPr>
-          <w:b/>
-        </w:rPr>
-      </w:pPr>
-    </w:p>
-    <w:p>
-      <w:pPr>
-        <w:pStyle w:val="BodyText"/>
-        <w:ind w:left="355"/>
-      </w:pPr>
-      <w:r>
-        <w:rPr>
-          <w:color w:val="0B0B0B"/>
-          <w:spacing w:val="-5"/>
-        </w:rPr>
-        <w:t>To:</w:t>
-      </w:r>
-    </w:p>
-    <w:p>
-      <w:pPr>
-        <w:pStyle w:val="BodyText"/>
-        <w:spacing w:before="14"/>
-      </w:pPr>
-      <w:r>
-        <w:t>{{TENANT_NAMES}}</w:t>
-      </w:r>
-    </w:p>
-    <w:p>
-      <w:pPr>
-        <w:pStyle w:val="BodyText"/>
-        <w:ind w:left="355"/>
-      </w:pPr>
-      <w:r>
-        <w:rPr>
-          <w:color w:val="0B0B0B"/>
-        </w:rPr>
-        <w:t>Tenants</w:t>
-      </w:r>
-      <w:r>
-        <w:rPr>
-          <w:color w:val="0B0B0B"/>
-          <w:spacing w:val="-2"/>
-        </w:rPr>
-        <w:t xml:space="preserve"> </w:t>
-      </w:r>
-      <w:r>
-        <w:rPr>
-          <w:color w:val="0B0B0B"/>
-        </w:rPr>
-        <w:t>in</w:t>
-      </w:r>
-      <w:r>
-        <w:rPr>
-          <w:color w:val="0B0B0B"/>
-          <w:spacing w:val="-1"/>
-        </w:rPr>
-        <w:t xml:space="preserve"> </w:t>
-      </w:r>
-      <w:r>
-        <w:rPr>
-          <w:color w:val="0B0B0B"/>
-        </w:rPr>
-        <w:t>possession of</w:t>
-      </w:r>
-      <w:r>
-        <w:rPr>
-          <w:color w:val="0B0B0B"/>
-          <w:spacing w:val="-1"/>
-        </w:rPr>
-        <w:t xml:space="preserve"> </w:t>
-      </w:r>
-      <w:r>
-        <w:rPr>
-          <w:color w:val="0B0B0B"/>
-        </w:rPr>
-        <w:t>the</w:t>
-      </w:r>
-      <w:r>
-        <w:rPr>
-          <w:color w:val="0B0B0B"/>
-          <w:spacing w:val="-1"/>
-        </w:rPr>
-        <w:t xml:space="preserve"> </w:t>
-      </w:r>
-      <w:r>
-        <w:rPr>
-          <w:color w:val="0B0B0B"/>
-        </w:rPr>
-        <w:t>premises herein</w:t>
-      </w:r>
-      <w:r>
-        <w:rPr>
-          <w:color w:val="0B0B0B"/>
-          <w:spacing w:val="-1"/>
-        </w:rPr>
-        <w:t xml:space="preserve"> </w:t>
-      </w:r>
-      <w:r>
-        <w:rPr>
-          <w:color w:val="0B0B0B"/>
-        </w:rPr>
-        <w:t>referred</w:t>
-      </w:r>
-      <w:r>
-        <w:rPr>
-          <w:color w:val="0B0B0B"/>
-          <w:spacing w:val="-1"/>
-        </w:rPr>
-        <w:t xml:space="preserve"> </w:t>
-      </w:r>
-      <w:r>
-        <w:rPr>
-          <w:color w:val="0B0B0B"/>
-        </w:rPr>
-        <w:t>to are</w:t>
-      </w:r>
-      <w:r>
-        <w:rPr>
-          <w:color w:val="0B0B0B"/>
-          <w:spacing w:val="-1"/>
-        </w:rPr>
-        <w:t xml:space="preserve"> </w:t>
-      </w:r>
-      <w:r>
-        <w:rPr>
-          <w:color w:val="0B0B0B"/>
-        </w:rPr>
-        <w:t xml:space="preserve">situated </w:t>
-      </w:r>
-      <w:r>
-        <w:rPr>
-          <w:color w:val="0B0B0B"/>
-          <w:spacing w:val="-5"/>
-        </w:rPr>
-        <w:t>at:</w:t>
-      </w:r>
-    </w:p>
-    <w:p>
-      <w:pPr>
-        <w:pStyle w:val="BodyText"/>
-      </w:pPr>
-      <w:r>
-        <w:t>{{PROPERTY_ADDRESS_STREET}}</w:t>
-      </w:r>
-    </w:p>
-    <w:p>
-      <w:pPr>
-        <w:pStyle w:val="BodyText"/>
-      </w:pPr>
-      <w:r>
-        <w:t>{{PROPERTY_ADDRESS_CITY}}</w:t>
-      </w:r>
-    </w:p>
-    <w:p>
-      <w:pPr>
-        <w:pStyle w:val="BodyText"/>
-        <w:spacing w:before="41"/>
-      </w:pPr>
-    </w:p>
-    <w:p>
-      <w:pPr>
-        <w:pStyle w:val="BodyText"/>
-        <w:ind w:left="1085"/>
-      </w:pPr>
-      <w:r>
-        <w:rPr>
-          <w:color w:val="0B0B0B"/>
-        </w:rPr>
-        <w:t>COUNTY</w:t>
-      </w:r>
-      <w:r>
-        <w:rPr>
-          <w:color w:val="0B0B0B"/>
-          <w:spacing w:val="-1"/>
-        </w:rPr>
-        <w:t xml:space="preserve"> </w:t>
-      </w:r>
-      <w:r>
-        <w:rPr>
-          <w:color w:val="0B0B0B"/>
-          <w:spacing w:val="-5"/>
-        </w:rPr>
-        <w:t>OF {{COUNTY}}</w:t>
-      </w:r>
-    </w:p>
-    <w:p>
-      <w:pPr>
-        <w:pStyle w:val="BodyText"/>
-        <w:spacing w:before="19"/>
-        <w:ind w:left="362"/>
-      </w:pPr>
-      <w:r>
-        <w:rPr>
-          <w:color w:val="0B0B0B"/>
-        </w:rPr>
-        <w:t>[hereinafter</w:t>
-      </w:r>
-      <w:r>
-        <w:rPr>
-          <w:color w:val="0B0B0B"/>
-          <w:spacing w:val="-8"/>
-        </w:rPr>
-        <w:t xml:space="preserve"> </w:t>
-      </w:r>
-      <w:r>
-        <w:rPr>
-          <w:color w:val="0B0B0B"/>
-        </w:rPr>
-        <w:t>called</w:t>
-      </w:r>
-      <w:r>
-        <w:rPr>
-          <w:color w:val="0B0B0B"/>
-          <w:spacing w:val="-6"/>
-        </w:rPr>
-        <w:t xml:space="preserve"> </w:t>
-      </w:r>
-      <w:r>
-        <w:rPr>
-          <w:color w:val="0B0B0B"/>
-        </w:rPr>
-        <w:t>the</w:t>
-      </w:r>
-      <w:r>
-        <w:rPr>
-          <w:color w:val="0B0B0B"/>
-          <w:spacing w:val="-3"/>
-        </w:rPr>
-        <w:t xml:space="preserve"> </w:t>
-      </w:r>
-      <w:r>
-        <w:rPr>
-          <w:color w:val="0B0B0B"/>
-        </w:rPr>
-        <w:t>"Premises"]</w:t>
-      </w:r>
-      <w:r>
-        <w:rPr>
-          <w:color w:val="0B0B0B"/>
-          <w:spacing w:val="-6"/>
-        </w:rPr>
-        <w:t xml:space="preserve"> </w:t>
-      </w:r>
-      <w:r>
-        <w:rPr>
-          <w:color w:val="0B0B0B"/>
-        </w:rPr>
-        <w:t>and</w:t>
-      </w:r>
-      <w:r>
-        <w:rPr>
-          <w:color w:val="0B0B0B"/>
-          <w:spacing w:val="-3"/>
-        </w:rPr>
-        <w:t xml:space="preserve"> </w:t>
-      </w:r>
-      <w:r>
-        <w:rPr>
-          <w:color w:val="0B0B0B"/>
-        </w:rPr>
-        <w:t>all</w:t>
-      </w:r>
-      <w:r>
-        <w:rPr>
-          <w:color w:val="0B0B0B"/>
-          <w:spacing w:val="-3"/>
-        </w:rPr>
-        <w:t xml:space="preserve"> </w:t>
-      </w:r>
-      <w:r>
-        <w:rPr>
-          <w:color w:val="0B0B0B"/>
-        </w:rPr>
-        <w:t>notices</w:t>
-      </w:r>
-      <w:r>
-        <w:rPr>
-          <w:color w:val="0B0B0B"/>
-          <w:spacing w:val="-4"/>
-        </w:rPr>
-        <w:t xml:space="preserve"> </w:t>
-      </w:r>
-      <w:r>
-        <w:rPr>
-          <w:color w:val="0B0B0B"/>
-          <w:spacing w:val="-2"/>
-        </w:rPr>
-        <w:t>thereafter:</w:t>
-      </w:r>
-    </w:p>
-    <w:p>
-      <w:pPr>
-        <w:pStyle w:val="BodyText"/>
-        <w:spacing w:before="23"/>
-      </w:pPr>
-    </w:p>
-    <w:p>
-      <w:pPr>
-        <w:pStyle w:val="BodyText"/>
-        <w:spacing w:line="252" w:lineRule="auto"/>
-        <w:ind w:left="360" w:right="1504"/>
-      </w:pPr>
-      <w:r>
-        <w:rPr>
-          <w:b/>
-          <w:color w:val="0B0B0B"/>
-        </w:rPr>
-        <w:t xml:space="preserve">PLEASE TAKE NOTICE </w:t>
-      </w:r>
-      <w:r>
-        <w:rPr>
-          <w:color w:val="0B0B0B"/>
-        </w:rPr>
-        <w:t>that pursuant to the terms of tenancy for the above-referenced agreement</w:t>
-      </w:r>
-      <w:r>
-        <w:rPr>
-          <w:color w:val="0B0B0B"/>
-          <w:spacing w:val="-3"/>
-        </w:rPr>
-        <w:t xml:space="preserve"> </w:t>
-      </w:r>
-      <w:r>
-        <w:rPr>
-          <w:color w:val="0B0B0B"/>
-        </w:rPr>
-        <w:t>by</w:t>
-      </w:r>
-      <w:r>
-        <w:rPr>
-          <w:color w:val="0B0B0B"/>
-          <w:spacing w:val="-3"/>
-        </w:rPr>
-        <w:t xml:space="preserve"> </w:t>
-      </w:r>
-      <w:r>
-        <w:rPr>
-          <w:color w:val="0B0B0B"/>
-        </w:rPr>
-        <w:t>which</w:t>
-      </w:r>
-      <w:r>
-        <w:rPr>
-          <w:color w:val="0B0B0B"/>
-          <w:spacing w:val="-3"/>
-        </w:rPr>
-        <w:t xml:space="preserve"> </w:t>
-      </w:r>
-      <w:r>
-        <w:rPr>
-          <w:color w:val="0B0B0B"/>
-        </w:rPr>
-        <w:t>you</w:t>
-      </w:r>
-      <w:r>
-        <w:rPr>
-          <w:color w:val="0B0B0B"/>
-          <w:spacing w:val="-3"/>
-        </w:rPr>
-        <w:t xml:space="preserve"> </w:t>
-      </w:r>
-      <w:r>
-        <w:rPr>
-          <w:color w:val="0B0B0B"/>
-        </w:rPr>
-        <w:t>hold</w:t>
-      </w:r>
-      <w:r>
-        <w:rPr>
-          <w:color w:val="0B0B0B"/>
-          <w:spacing w:val="-3"/>
-        </w:rPr>
-        <w:t xml:space="preserve"> </w:t>
-      </w:r>
-      <w:r>
-        <w:rPr>
-          <w:color w:val="0B0B0B"/>
-        </w:rPr>
-        <w:t>the</w:t>
-      </w:r>
-      <w:r>
-        <w:rPr>
-          <w:color w:val="0B0B0B"/>
-          <w:spacing w:val="-5"/>
-        </w:rPr>
-        <w:t xml:space="preserve"> </w:t>
-      </w:r>
-      <w:r>
-        <w:rPr>
-          <w:color w:val="0B0B0B"/>
-        </w:rPr>
-        <w:t>possession</w:t>
-      </w:r>
-      <w:r>
-        <w:rPr>
-          <w:color w:val="0B0B0B"/>
-          <w:spacing w:val="-3"/>
-        </w:rPr>
-        <w:t xml:space="preserve"> </w:t>
-      </w:r>
-      <w:r>
-        <w:rPr>
-          <w:color w:val="0B0B0B"/>
-        </w:rPr>
-        <w:t>of</w:t>
-      </w:r>
-      <w:r>
-        <w:rPr>
-          <w:color w:val="0B0B0B"/>
-          <w:spacing w:val="-3"/>
-        </w:rPr>
-        <w:t xml:space="preserve"> </w:t>
-      </w:r>
-      <w:r>
-        <w:rPr>
-          <w:color w:val="0B0B0B"/>
-        </w:rPr>
-        <w:t>the</w:t>
-      </w:r>
-      <w:r>
-        <w:rPr>
-          <w:color w:val="0B0B0B"/>
-          <w:spacing w:val="-3"/>
-        </w:rPr>
-        <w:t xml:space="preserve"> </w:t>
-      </w:r>
-      <w:r>
-        <w:rPr>
-          <w:color w:val="0B0B0B"/>
-        </w:rPr>
-        <w:t>Premises</w:t>
-      </w:r>
-      <w:r>
-        <w:rPr>
-          <w:color w:val="0B0B0B"/>
-          <w:spacing w:val="-4"/>
-        </w:rPr>
-        <w:t xml:space="preserve"> </w:t>
-      </w:r>
-      <w:r>
-        <w:rPr>
-          <w:color w:val="0B0B0B"/>
-        </w:rPr>
-        <w:t>described</w:t>
-      </w:r>
-      <w:r>
-        <w:rPr>
-          <w:color w:val="0B0B0B"/>
-          <w:spacing w:val="-3"/>
-        </w:rPr>
-        <w:t xml:space="preserve"> </w:t>
-      </w:r>
-      <w:r>
-        <w:rPr>
-          <w:color w:val="0B0B0B"/>
-        </w:rPr>
-        <w:t>in</w:t>
-      </w:r>
-      <w:r>
-        <w:rPr>
-          <w:color w:val="0B0B0B"/>
-          <w:spacing w:val="-3"/>
-        </w:rPr>
-        <w:t xml:space="preserve"> </w:t>
-      </w:r>
-      <w:r>
-        <w:rPr>
-          <w:color w:val="0B0B0B"/>
-        </w:rPr>
-        <w:t>this</w:t>
-      </w:r>
-      <w:r>
-        <w:rPr>
-          <w:color w:val="0B0B0B"/>
-          <w:spacing w:val="-7"/>
-        </w:rPr>
-        <w:t xml:space="preserve"> </w:t>
-      </w:r>
-      <w:r>
-        <w:rPr>
-          <w:color w:val="0B0B0B"/>
-        </w:rPr>
-        <w:t>Notice,</w:t>
-      </w:r>
-      <w:r>
-        <w:rPr>
-          <w:color w:val="0B0B0B"/>
-          <w:spacing w:val="-3"/>
-        </w:rPr>
-        <w:t xml:space="preserve"> </w:t>
-      </w:r>
-      <w:r>
-        <w:rPr>
-          <w:color w:val="0B0B0B"/>
-        </w:rPr>
-        <w:t>there</w:t>
-      </w:r>
-      <w:r>
-        <w:rPr>
-          <w:color w:val="0B0B0B"/>
-          <w:spacing w:val="-2"/>
-        </w:rPr>
-        <w:t xml:space="preserve"> </w:t>
-      </w:r>
-      <w:r>
-        <w:rPr>
-          <w:color w:val="0B0B0B"/>
-        </w:rPr>
-        <w:t xml:space="preserve">is now due, unpaid, and delinquent rent in the following amounts for the following specified </w:t>
-      </w:r>
-      <w:r>
-        <w:rPr>
-          <w:color w:val="0B0B0B"/>
-          <w:spacing w:val="-2"/>
-        </w:rPr>
-        <w:t>periods:</w:t>
-      </w:r>
-    </w:p>
-    <w:p>
-      <w:pPr>
-        <w:pStyle w:val="BodyText"/>
-        <w:spacing w:line="252" w:lineRule="auto"/>
-        <w:sectPr>
-          <w:footerReference w:type="default" r:id="rId10"/>
-          <w:type w:val="continuous"/>
-          <w:pgSz w:w="12240" w:h="15840"/>
-          <w:pgMar w:top="0" w:right="360" w:bottom="660" w:left="1080" w:header="0" w:footer="474" w:gutter="0"/>
-          <w:pgNumType w:start="1"/>
-          <w:cols w:space="720"/>
-        </w:sectPr>
-      </w:pPr>
-    </w:p>
-    <w:p>
-      <w:pPr>
-        <w:spacing w:before="34"/>
-        <w:ind w:left="2518"/>
-        <w:rPr>
-          <w:b/>
-          <w:sz w:val="23"/>
-        </w:rPr>
-      </w:pPr>
-      <w:r>
-        <w:rPr>
-          <w:b/>
-          <w:color w:val="0B0B0B"/>
-          <w:sz w:val="23"/>
-          <w:u w:val="single" w:color="0B0B0B"/>
-        </w:rPr>
-        <w:t xml:space="preserve">DUE </w:t>
-      </w:r>
-      <w:r>
-        <w:rPr>
-          <w:b/>
-          <w:color w:val="0B0B0B"/>
-          <w:spacing w:val="-4"/>
-          <w:sz w:val="23"/>
-          <w:u w:val="single" w:color="0B0B0B"/>
-        </w:rPr>
-        <w:t>DATE</w:t>
-      </w:r>
-    </w:p>
-    <w:p>
-      <w:pPr>
-        <w:ind w:left="1103"/>
-        <w:rPr>
-          <w:b/>
-          <w:sz w:val="23"/>
-        </w:rPr>
-      </w:pPr>
-      <w:r>
-        <w:br w:type="column"/>
-      </w:r>
-      <w:r>
-        <w:rPr>
-          <w:b/>
-          <w:color w:val="0B0B0B"/>
-          <w:sz w:val="23"/>
-          <w:u w:val="single" w:color="0B0B0B"/>
-        </w:rPr>
-        <w:t xml:space="preserve">AMOUNT </w:t>
-      </w:r>
-      <w:r>
-        <w:rPr>
-          <w:b/>
-          <w:color w:val="0B0B0B"/>
-          <w:spacing w:val="-5"/>
-          <w:sz w:val="23"/>
-          <w:u w:val="single" w:color="0B0B0B"/>
-        </w:rPr>
-        <w:t>DUE</w:t>
-      </w:r>
-    </w:p>
-    <w:p>
-      <w:pPr>
-        <w:rPr>
-          <w:b/>
-          <w:sz w:val="23"/>
-        </w:rPr>
-        <w:sectPr>
-          <w:type w:val="continuous"/>
-          <w:pgSz w:w="12240" w:h="15840"/>
-          <w:pgMar w:top="0" w:right="360" w:bottom="660" w:left="1080" w:header="0" w:footer="474" w:gutter="0"/>
-          <w:cols w:num="2" w:space="720" w:equalWidth="0">
-            <w:col w:w="4998" w:space="40"/>
-            <w:col w:w="5762"/>
-          </w:cols>
-        </w:sectPr>
-      </w:pPr>
-      <w:r>
-        <w:t>{{RENT_DUE_DATE}}</w:t>
-        <w:tab/>
-        <w:t>{{AMOUNT_DUE}}</w:t>
-      </w:r>
-    </w:p>
-    <w:p>
-      <w:pPr>
-        <w:pStyle w:val="BodyText"/>
-        <w:rPr>
-          <w:b/>
         </w:rPr>
       </w:pPr>
       <w:r>
@@ -870,6 +108,768 @@
           </mc:Fallback>
         </mc:AlternateContent>
       </w:r>
+    </w:p>
+    <w:p>
+      <w:pPr>
+        <w:pStyle w:val="BodyText"/>
+        <w:rPr>
+          <w:sz w:val="31"/>
+        </w:rPr>
+      </w:pPr>
+    </w:p>
+    <w:p>
+      <w:pPr>
+        <w:pStyle w:val="BodyText"/>
+        <w:rPr>
+          <w:sz w:val="31"/>
+        </w:rPr>
+      </w:pPr>
+    </w:p>
+    <w:p>
+      <w:pPr>
+        <w:pStyle w:val="BodyText"/>
+        <w:rPr>
+          <w:sz w:val="31"/>
+        </w:rPr>
+      </w:pPr>
+    </w:p>
+    <w:p>
+      <w:pPr>
+        <w:pStyle w:val="BodyText"/>
+        <w:spacing w:before="179"/>
+        <w:rPr>
+          <w:sz w:val="31"/>
+        </w:rPr>
+      </w:pPr>
+    </w:p>
+    <w:p>
+      <w:pPr>
+        <w:pStyle w:val="Title"/>
+      </w:pPr>
+      <w:r>
+        <w:rPr>
+          <w:color w:val="0B0B0B"/>
+        </w:rPr>
+        <w:t>THREE</w:t>
+      </w:r>
+      <w:r>
+        <w:rPr>
+          <w:color w:val="0B0B0B"/>
+          <w:spacing w:val="-6"/>
+        </w:rPr>
+        <w:t xml:space="preserve"> </w:t>
+      </w:r>
+      <w:r>
+        <w:rPr>
+          <w:color w:val="0B0B0B"/>
+        </w:rPr>
+        <w:t>(3)</w:t>
+      </w:r>
+      <w:r>
+        <w:rPr>
+          <w:color w:val="0B0B0B"/>
+          <w:spacing w:val="-8"/>
+        </w:rPr>
+        <w:t xml:space="preserve"> </w:t>
+      </w:r>
+      <w:r>
+        <w:rPr>
+          <w:color w:val="0B0B0B"/>
+        </w:rPr>
+        <w:t>DAY</w:t>
+      </w:r>
+      <w:r>
+        <w:rPr>
+          <w:color w:val="0B0B0B"/>
+          <w:spacing w:val="-5"/>
+        </w:rPr>
+        <w:t xml:space="preserve"> </w:t>
+      </w:r>
+      <w:r>
+        <w:rPr>
+          <w:color w:val="0B0B0B"/>
+        </w:rPr>
+        <w:t>NOTICE</w:t>
+      </w:r>
+      <w:r>
+        <w:rPr>
+          <w:color w:val="0B0B0B"/>
+          <w:spacing w:val="-8"/>
+        </w:rPr>
+        <w:t xml:space="preserve"> </w:t>
+      </w:r>
+      <w:r>
+        <w:rPr>
+          <w:color w:val="0B0B0B"/>
+        </w:rPr>
+        <w:t>TO</w:t>
+      </w:r>
+      <w:r>
+        <w:rPr>
+          <w:color w:val="0B0B0B"/>
+          <w:spacing w:val="-9"/>
+        </w:rPr>
+        <w:t xml:space="preserve"> </w:t>
+      </w:r>
+      <w:r>
+        <w:rPr>
+          <w:color w:val="0B0B0B"/>
+        </w:rPr>
+        <w:t>PAY</w:t>
+      </w:r>
+      <w:r>
+        <w:rPr>
+          <w:color w:val="0B0B0B"/>
+          <w:spacing w:val="-9"/>
+        </w:rPr>
+        <w:t xml:space="preserve"> </w:t>
+      </w:r>
+      <w:r>
+        <w:rPr>
+          <w:color w:val="0B0B0B"/>
+        </w:rPr>
+        <w:t>OR</w:t>
+      </w:r>
+      <w:r>
+        <w:rPr>
+          <w:color w:val="0B0B0B"/>
+          <w:spacing w:val="-6"/>
+        </w:rPr>
+        <w:t xml:space="preserve"> </w:t>
+      </w:r>
+      <w:r>
+        <w:rPr>
+          <w:color w:val="0B0B0B"/>
+          <w:spacing w:val="-4"/>
+        </w:rPr>
+        <w:t>QUIT</w:t>
+      </w:r>
+    </w:p>
+    <w:p>
+      <w:pPr>
+        <w:pStyle w:val="BodyText"/>
+        <w:spacing w:before="29"/>
+        <w:rPr>
+          <w:b/>
+        </w:rPr>
+      </w:pPr>
+    </w:p>
+    <w:p>
+      <w:pPr>
+        <w:pStyle w:val="BodyText"/>
+        <w:ind w:left="355"/>
+      </w:pPr>
+      <w:r>
+        <w:rPr>
+          <w:color w:val="0B0B0B"/>
+          <w:spacing w:val="-5"/>
+        </w:rPr>
+        <w:t>To:</w:t>
+      </w:r>
+    </w:p>
+    <w:p>
+      <w:pPr>
+        <w:pStyle w:val="BodyText"/>
+        <w:spacing w:before="14"/>
+      </w:pPr>
+      <w:r>
+        <w:t>{{TENANT_NAMES}}</w:t>
+      </w:r>
+    </w:p>
+    <w:p>
+      <w:pPr>
+        <w:pStyle w:val="BodyText"/>
+        <w:ind w:left="355"/>
+      </w:pPr>
+      <w:r>
+        <w:rPr>
+          <w:color w:val="0B0B0B"/>
+        </w:rPr>
+        <w:t>Tenants</w:t>
+      </w:r>
+      <w:r>
+        <w:rPr>
+          <w:color w:val="0B0B0B"/>
+          <w:spacing w:val="-2"/>
+        </w:rPr>
+        <w:t xml:space="preserve"> </w:t>
+      </w:r>
+      <w:r>
+        <w:rPr>
+          <w:color w:val="0B0B0B"/>
+        </w:rPr>
+        <w:t>in</w:t>
+      </w:r>
+      <w:r>
+        <w:rPr>
+          <w:color w:val="0B0B0B"/>
+          <w:spacing w:val="-1"/>
+        </w:rPr>
+        <w:t xml:space="preserve"> </w:t>
+      </w:r>
+      <w:r>
+        <w:rPr>
+          <w:color w:val="0B0B0B"/>
+        </w:rPr>
+        <w:t>possession of</w:t>
+      </w:r>
+      <w:r>
+        <w:rPr>
+          <w:color w:val="0B0B0B"/>
+          <w:spacing w:val="-1"/>
+        </w:rPr>
+        <w:t xml:space="preserve"> </w:t>
+      </w:r>
+      <w:r>
+        <w:rPr>
+          <w:color w:val="0B0B0B"/>
+        </w:rPr>
+        <w:t>the</w:t>
+      </w:r>
+      <w:r>
+        <w:rPr>
+          <w:color w:val="0B0B0B"/>
+          <w:spacing w:val="-1"/>
+        </w:rPr>
+        <w:t xml:space="preserve"> </w:t>
+      </w:r>
+      <w:r>
+        <w:rPr>
+          <w:color w:val="0B0B0B"/>
+        </w:rPr>
+        <w:t>premises herein</w:t>
+      </w:r>
+      <w:r>
+        <w:rPr>
+          <w:color w:val="0B0B0B"/>
+          <w:spacing w:val="-1"/>
+        </w:rPr>
+        <w:t xml:space="preserve"> </w:t>
+      </w:r>
+      <w:r>
+        <w:rPr>
+          <w:color w:val="0B0B0B"/>
+        </w:rPr>
+        <w:t>referred</w:t>
+      </w:r>
+      <w:r>
+        <w:rPr>
+          <w:color w:val="0B0B0B"/>
+          <w:spacing w:val="-1"/>
+        </w:rPr>
+        <w:t xml:space="preserve"> </w:t>
+      </w:r>
+      <w:r>
+        <w:rPr>
+          <w:color w:val="0B0B0B"/>
+        </w:rPr>
+        <w:t>to are</w:t>
+      </w:r>
+      <w:r>
+        <w:rPr>
+          <w:color w:val="0B0B0B"/>
+          <w:spacing w:val="-1"/>
+        </w:rPr>
+        <w:t xml:space="preserve"> </w:t>
+      </w:r>
+      <w:r>
+        <w:rPr>
+          <w:color w:val="0B0B0B"/>
+        </w:rPr>
+        <w:t xml:space="preserve">situated </w:t>
+      </w:r>
+      <w:r>
+        <w:rPr>
+          <w:color w:val="0B0B0B"/>
+          <w:spacing w:val="-5"/>
+        </w:rPr>
+        <w:t>at:</w:t>
+      </w:r>
+    </w:p>
+    <w:p>
+      <w:pPr>
+        <w:pStyle w:val="BodyText"/>
+      </w:pPr>
+      <w:r>
+        <w:t>{{PROPERTY_ADDRESS_STREET}}</w:t>
+      </w:r>
+    </w:p>
+    <w:p>
+      <w:pPr>
+        <w:pStyle w:val="BodyText"/>
+      </w:pPr>
+      <w:r>
+        <w:t>{{PROPERTY_ADDRESS_CITY}}</w:t>
+      </w:r>
+    </w:p>
+    <w:p>
+      <w:pPr>
+        <w:pStyle w:val="BodyText"/>
+        <w:spacing w:before="41"/>
+      </w:pPr>
+    </w:p>
+    <w:p>
+      <w:pPr>
+        <w:pStyle w:val="BodyText"/>
+        <w:ind w:left="1085"/>
+      </w:pPr>
+      <w:r>
+        <w:rPr>
+          <w:color w:val="0B0B0B"/>
+        </w:rPr>
+        <w:t>COUNTY</w:t>
+      </w:r>
+      <w:r>
+        <w:rPr>
+          <w:color w:val="0B0B0B"/>
+          <w:spacing w:val="-1"/>
+        </w:rPr>
+        <w:t xml:space="preserve"> </w:t>
+      </w:r>
+      <w:r>
+        <w:rPr>
+          <w:color w:val="0B0B0B"/>
+          <w:spacing w:val="-5"/>
+        </w:rPr>
+        <w:t>OF {{COUNTY}}</w:t>
+      </w:r>
+    </w:p>
+    <w:p>
+      <w:pPr>
+        <w:pStyle w:val="BodyText"/>
+        <w:spacing w:before="19"/>
+        <w:ind w:left="362"/>
+      </w:pPr>
+      <w:r>
+        <w:rPr>
+          <w:color w:val="0B0B0B"/>
+        </w:rPr>
+        <w:t>[hereinafter</w:t>
+      </w:r>
+      <w:r>
+        <w:rPr>
+          <w:color w:val="0B0B0B"/>
+          <w:spacing w:val="-8"/>
+        </w:rPr>
+        <w:t xml:space="preserve"> </w:t>
+      </w:r>
+      <w:r>
+        <w:rPr>
+          <w:color w:val="0B0B0B"/>
+        </w:rPr>
+        <w:t>called</w:t>
+      </w:r>
+      <w:r>
+        <w:rPr>
+          <w:color w:val="0B0B0B"/>
+          <w:spacing w:val="-6"/>
+        </w:rPr>
+        <w:t xml:space="preserve"> </w:t>
+      </w:r>
+      <w:r>
+        <w:rPr>
+          <w:color w:val="0B0B0B"/>
+        </w:rPr>
+        <w:t>the</w:t>
+      </w:r>
+      <w:r>
+        <w:rPr>
+          <w:color w:val="0B0B0B"/>
+          <w:spacing w:val="-3"/>
+        </w:rPr>
+        <w:t xml:space="preserve"> </w:t>
+      </w:r>
+      <w:r>
+        <w:rPr>
+          <w:color w:val="0B0B0B"/>
+        </w:rPr>
+        <w:t>"Premises"]</w:t>
+      </w:r>
+      <w:r>
+        <w:rPr>
+          <w:color w:val="0B0B0B"/>
+          <w:spacing w:val="-6"/>
+        </w:rPr>
+        <w:t xml:space="preserve"> </w:t>
+      </w:r>
+      <w:r>
+        <w:rPr>
+          <w:color w:val="0B0B0B"/>
+        </w:rPr>
+        <w:t>and</w:t>
+      </w:r>
+      <w:r>
+        <w:rPr>
+          <w:color w:val="0B0B0B"/>
+          <w:spacing w:val="-3"/>
+        </w:rPr>
+        <w:t xml:space="preserve"> </w:t>
+      </w:r>
+      <w:r>
+        <w:rPr>
+          <w:color w:val="0B0B0B"/>
+        </w:rPr>
+        <w:t>all</w:t>
+      </w:r>
+      <w:r>
+        <w:rPr>
+          <w:color w:val="0B0B0B"/>
+          <w:spacing w:val="-3"/>
+        </w:rPr>
+        <w:t xml:space="preserve"> </w:t>
+      </w:r>
+      <w:r>
+        <w:rPr>
+          <w:color w:val="0B0B0B"/>
+        </w:rPr>
+        <w:t>notices</w:t>
+      </w:r>
+      <w:r>
+        <w:rPr>
+          <w:color w:val="0B0B0B"/>
+          <w:spacing w:val="-4"/>
+        </w:rPr>
+        <w:t xml:space="preserve"> </w:t>
+      </w:r>
+      <w:r>
+        <w:rPr>
+          <w:color w:val="0B0B0B"/>
+          <w:spacing w:val="-2"/>
+        </w:rPr>
+        <w:t>thereafter:</w:t>
+      </w:r>
+    </w:p>
+    <w:p>
+      <w:pPr>
+        <w:pStyle w:val="BodyText"/>
+        <w:spacing w:before="23"/>
+      </w:pPr>
+    </w:p>
+    <w:p>
+      <w:pPr>
+        <w:pStyle w:val="BodyText"/>
+        <w:spacing w:line="252" w:lineRule="auto"/>
+        <w:ind w:left="360" w:right="1504"/>
+      </w:pPr>
+      <w:r>
+        <w:rPr>
+          <w:b/>
+          <w:color w:val="0B0B0B"/>
+        </w:rPr>
+        <w:t xml:space="preserve">PLEASE TAKE NOTICE </w:t>
+      </w:r>
+      <w:r>
+        <w:rPr>
+          <w:color w:val="0B0B0B"/>
+        </w:rPr>
+        <w:t>that pursuant to the terms of tenancy for the above-referenced agreement</w:t>
+      </w:r>
+      <w:r>
+        <w:rPr>
+          <w:color w:val="0B0B0B"/>
+          <w:spacing w:val="-3"/>
+        </w:rPr>
+        <w:t xml:space="preserve"> </w:t>
+      </w:r>
+      <w:r>
+        <w:rPr>
+          <w:color w:val="0B0B0B"/>
+        </w:rPr>
+        <w:t>by</w:t>
+      </w:r>
+      <w:r>
+        <w:rPr>
+          <w:color w:val="0B0B0B"/>
+          <w:spacing w:val="-3"/>
+        </w:rPr>
+        <w:t xml:space="preserve"> </w:t>
+      </w:r>
+      <w:r>
+        <w:rPr>
+          <w:color w:val="0B0B0B"/>
+        </w:rPr>
+        <w:t>which</w:t>
+      </w:r>
+      <w:r>
+        <w:rPr>
+          <w:color w:val="0B0B0B"/>
+          <w:spacing w:val="-3"/>
+        </w:rPr>
+        <w:t xml:space="preserve"> </w:t>
+      </w:r>
+      <w:r>
+        <w:rPr>
+          <w:color w:val="0B0B0B"/>
+        </w:rPr>
+        <w:t>you</w:t>
+      </w:r>
+      <w:r>
+        <w:rPr>
+          <w:color w:val="0B0B0B"/>
+          <w:spacing w:val="-3"/>
+        </w:rPr>
+        <w:t xml:space="preserve"> </w:t>
+      </w:r>
+      <w:r>
+        <w:rPr>
+          <w:color w:val="0B0B0B"/>
+        </w:rPr>
+        <w:t>hold</w:t>
+      </w:r>
+      <w:r>
+        <w:rPr>
+          <w:color w:val="0B0B0B"/>
+          <w:spacing w:val="-3"/>
+        </w:rPr>
+        <w:t xml:space="preserve"> </w:t>
+      </w:r>
+      <w:r>
+        <w:rPr>
+          <w:color w:val="0B0B0B"/>
+        </w:rPr>
+        <w:t>the</w:t>
+      </w:r>
+      <w:r>
+        <w:rPr>
+          <w:color w:val="0B0B0B"/>
+          <w:spacing w:val="-5"/>
+        </w:rPr>
+        <w:t xml:space="preserve"> </w:t>
+      </w:r>
+      <w:r>
+        <w:rPr>
+          <w:color w:val="0B0B0B"/>
+        </w:rPr>
+        <w:t>possession</w:t>
+      </w:r>
+      <w:r>
+        <w:rPr>
+          <w:color w:val="0B0B0B"/>
+          <w:spacing w:val="-3"/>
+        </w:rPr>
+        <w:t xml:space="preserve"> </w:t>
+      </w:r>
+      <w:r>
+        <w:rPr>
+          <w:color w:val="0B0B0B"/>
+        </w:rPr>
+        <w:t>of</w:t>
+      </w:r>
+      <w:r>
+        <w:rPr>
+          <w:color w:val="0B0B0B"/>
+          <w:spacing w:val="-3"/>
+        </w:rPr>
+        <w:t xml:space="preserve"> </w:t>
+      </w:r>
+      <w:r>
+        <w:rPr>
+          <w:color w:val="0B0B0B"/>
+        </w:rPr>
+        <w:t>the</w:t>
+      </w:r>
+      <w:r>
+        <w:rPr>
+          <w:color w:val="0B0B0B"/>
+          <w:spacing w:val="-3"/>
+        </w:rPr>
+        <w:t xml:space="preserve"> </w:t>
+      </w:r>
+      <w:r>
+        <w:rPr>
+          <w:color w:val="0B0B0B"/>
+        </w:rPr>
+        <w:t>Premises</w:t>
+      </w:r>
+      <w:r>
+        <w:rPr>
+          <w:color w:val="0B0B0B"/>
+          <w:spacing w:val="-4"/>
+        </w:rPr>
+        <w:t xml:space="preserve"> </w:t>
+      </w:r>
+      <w:r>
+        <w:rPr>
+          <w:color w:val="0B0B0B"/>
+        </w:rPr>
+        <w:t>described</w:t>
+      </w:r>
+      <w:r>
+        <w:rPr>
+          <w:color w:val="0B0B0B"/>
+          <w:spacing w:val="-3"/>
+        </w:rPr>
+        <w:t xml:space="preserve"> </w:t>
+      </w:r>
+      <w:r>
+        <w:rPr>
+          <w:color w:val="0B0B0B"/>
+        </w:rPr>
+        <w:t>in</w:t>
+      </w:r>
+      <w:r>
+        <w:rPr>
+          <w:color w:val="0B0B0B"/>
+          <w:spacing w:val="-3"/>
+        </w:rPr>
+        <w:t xml:space="preserve"> </w:t>
+      </w:r>
+      <w:r>
+        <w:rPr>
+          <w:color w:val="0B0B0B"/>
+        </w:rPr>
+        <w:t>this</w:t>
+      </w:r>
+      <w:r>
+        <w:rPr>
+          <w:color w:val="0B0B0B"/>
+          <w:spacing w:val="-7"/>
+        </w:rPr>
+        <w:t xml:space="preserve"> </w:t>
+      </w:r>
+      <w:r>
+        <w:rPr>
+          <w:color w:val="0B0B0B"/>
+        </w:rPr>
+        <w:t>Notice,</w:t>
+      </w:r>
+      <w:r>
+        <w:rPr>
+          <w:color w:val="0B0B0B"/>
+          <w:spacing w:val="-3"/>
+        </w:rPr>
+        <w:t xml:space="preserve"> </w:t>
+      </w:r>
+      <w:r>
+        <w:rPr>
+          <w:color w:val="0B0B0B"/>
+        </w:rPr>
+        <w:t>there</w:t>
+      </w:r>
+      <w:r>
+        <w:rPr>
+          <w:color w:val="0B0B0B"/>
+          <w:spacing w:val="-2"/>
+        </w:rPr>
+        <w:t xml:space="preserve"> </w:t>
+      </w:r>
+      <w:r>
+        <w:rPr>
+          <w:color w:val="0B0B0B"/>
+        </w:rPr>
+        <w:t xml:space="preserve">is now due, unpaid, and delinquent rent in the following amounts for the following specified </w:t>
+      </w:r>
+      <w:r>
+        <w:rPr>
+          <w:color w:val="0B0B0B"/>
+          <w:spacing w:val="-2"/>
+        </w:rPr>
+        <w:t>periods:</w:t>
+      </w:r>
+    </w:p>
+    <w:p>
+      <w:pPr>
+        <w:pStyle w:val="BodyText"/>
+        <w:spacing w:line="252" w:lineRule="auto"/>
+        <w:sectPr>
+          <w:footerReference w:type="default" r:id="rId10"/>
+          <w:type w:val="continuous"/>
+          <w:pgSz w:w="12240" w:h="15840"/>
+          <w:pgMar w:top="0" w:right="360" w:bottom="660" w:left="1080" w:header="0" w:footer="474" w:gutter="0"/>
+          <w:pgNumType w:start="1"/>
+          <w:cols w:space="720"/>
+        </w:sectPr>
+      </w:pPr>
+    </w:p>
+    <w:p>
+      <w:pPr>
+        <w:spacing w:before="34"/>
+        <w:ind w:left="2518"/>
+        <w:rPr>
+          <w:b/>
+          <w:sz w:val="23"/>
+        </w:rPr>
+      </w:pPr>
+      <w:r>
+        <w:rPr>
+          <w:b/>
+          <w:color w:val="0B0B0B"/>
+          <w:sz w:val="23"/>
+          <w:u w:val="single" w:color="0B0B0B"/>
+        </w:rPr>
+        <w:t xml:space="preserve">DUE </w:t>
+      </w:r>
+      <w:r>
+        <w:rPr>
+          <w:b/>
+          <w:color w:val="0B0B0B"/>
+          <w:spacing w:val="-4"/>
+          <w:sz w:val="23"/>
+          <w:u w:val="single" w:color="0B0B0B"/>
+        </w:rPr>
+        <w:t>DATE</w:t>
+      </w:r>
+    </w:p>
+    <w:p>
+      <w:pPr>
+        <w:ind w:left="1103"/>
+        <w:rPr>
+          <w:b/>
+          <w:sz w:val="23"/>
+        </w:rPr>
+      </w:pPr>
+      <w:r>
+        <w:br w:type="column"/>
+      </w:r>
+      <w:r>
+        <w:rPr>
+          <w:b/>
+          <w:color w:val="0B0B0B"/>
+          <w:sz w:val="23"/>
+          <w:u w:val="single" w:color="0B0B0B"/>
+        </w:rPr>
+        <w:t xml:space="preserve">AMOUNT </w:t>
+      </w:r>
+      <w:r>
+        <w:rPr>
+          <w:b/>
+          <w:color w:val="0B0B0B"/>
+          <w:spacing w:val="-5"/>
+          <w:sz w:val="23"/>
+          <w:u w:val="single" w:color="0B0B0B"/>
+        </w:rPr>
+        <w:t>DUE</w:t>
+      </w:r>
+    </w:p>
+    <w:p>
+      <w:pPr>
+        <w:rPr>
+          <w:b/>
+          <w:sz w:val="23"/>
+        </w:rPr>
+        <w:sectPr>
+          <w:type w:val="continuous"/>
+          <w:pgSz w:w="12240" w:h="15840"/>
+          <w:pgMar w:top="0" w:right="360" w:bottom="660" w:left="1080" w:header="0" w:footer="474" w:gutter="0"/>
+          <w:cols w:num="2" w:space="720" w:equalWidth="0">
+            <w:col w:w="4998" w:space="40"/>
+            <w:col w:w="5762"/>
+          </w:cols>
+        </w:sectPr>
+      </w:pPr>
+      <w:r>
+        <w:t>{{RENT_DUE_DATE}}</w:t>
+        <w:tab/>
+        <w:t>{{AMOUNT_DUE}}</w:t>
+      </w:r>
+    </w:p>
+    <w:p>
+      <w:pPr>
+        <w:pStyle w:val="BodyText"/>
+        <w:rPr>
+          <w:b/>
+        </w:rPr>
+      </w:pPr>
     </w:p>
     <w:p>
       <w:pPr>

</xml_diff>